<commit_message>
Master Roster v3: Updated all salary ranges to Perplexity-verified market benchmarks
</commit_message>
<xml_diff>
--- a/operations/Audacion_AI_Labs_Master_Roster_v3.docx
+++ b/operations/Audacion_AI_Labs_Master_Roster_v3.docx
@@ -903,7 +903,7 @@
                 <w:sz w:val="14"/>
                 <w:szCs w:val="14"/>
               </w:rPr>
-              <w:t xml:space="preserve">Original</w:t>
+              <w:t xml:space="preserve">AI lab CEO / PBC principal</w:t>
             </w:r>
           </w:p>
         </w:tc>
@@ -1256,7 +1256,7 @@
                 <w:sz w:val="14"/>
                 <w:szCs w:val="14"/>
               </w:rPr>
-              <w:t xml:space="preserve">Gap Analysis</w:t>
+              <w:t xml:space="preserve">Levels.fyi / AI lab CSO</w:t>
             </w:r>
           </w:p>
         </w:tc>
@@ -1600,7 +1600,7 @@
                 <w:sz w:val="14"/>
                 <w:szCs w:val="14"/>
               </w:rPr>
-              <w:t xml:space="preserve">Gap Analysis</w:t>
+              <w:t xml:space="preserve">Built In LA / tech startup CoS</w:t>
             </w:r>
           </w:p>
         </w:tc>
@@ -1873,7 +1873,7 @@
                 <w:sz w:val="15"/>
                 <w:szCs w:val="15"/>
               </w:rPr>
-              <w:t xml:space="preserve">$220K to $300K</w:t>
+              <w:t xml:space="preserve">$165K to $215K</w:t>
             </w:r>
           </w:p>
         </w:tc>
@@ -1951,7 +1951,7 @@
                 <w:sz w:val="15"/>
                 <w:szCs w:val="15"/>
               </w:rPr>
-              <w:t xml:space="preserve">$106 to $144</w:t>
+              <w:t xml:space="preserve">$79 to $103</w:t>
             </w:r>
           </w:p>
         </w:tc>
@@ -1990,7 +1990,7 @@
                 <w:sz w:val="14"/>
                 <w:szCs w:val="14"/>
               </w:rPr>
-              <w:t xml:space="preserve">Original</w:t>
+              <w:t xml:space="preserve">ZipRecruiter SF / AI Safety Career Guide</w:t>
             </w:r>
           </w:p>
         </w:tc>
@@ -2220,7 +2220,7 @@
                 <w:sz w:val="15"/>
                 <w:szCs w:val="15"/>
               </w:rPr>
-              <w:t xml:space="preserve">$170K to $230K</w:t>
+              <w:t xml:space="preserve">$130K to $175K</w:t>
             </w:r>
           </w:p>
         </w:tc>
@@ -2296,7 +2296,7 @@
                 <w:sz w:val="15"/>
                 <w:szCs w:val="15"/>
               </w:rPr>
-              <w:t xml:space="preserve">$82 to $111</w:t>
+              <w:t xml:space="preserve">$63 to $84</w:t>
             </w:r>
           </w:p>
         </w:tc>
@@ -2334,7 +2334,7 @@
                 <w:sz w:val="14"/>
                 <w:szCs w:val="14"/>
               </w:rPr>
-              <w:t xml:space="preserve">Original</w:t>
+              <w:t xml:space="preserve">AI Safety Researcher CA / ZipRecruiter</w:t>
             </w:r>
           </w:p>
         </w:tc>
@@ -2570,7 +2570,7 @@
                 <w:sz w:val="15"/>
                 <w:szCs w:val="15"/>
               </w:rPr>
-              <w:t xml:space="preserve">$170K to $230K</w:t>
+              <w:t xml:space="preserve">$130K to $175K</w:t>
             </w:r>
           </w:p>
         </w:tc>
@@ -2648,7 +2648,7 @@
                 <w:sz w:val="15"/>
                 <w:szCs w:val="15"/>
               </w:rPr>
-              <w:t xml:space="preserve">$82 to $111</w:t>
+              <w:t xml:space="preserve">$63 to $84</w:t>
             </w:r>
           </w:p>
         </w:tc>
@@ -2687,7 +2687,7 @@
                 <w:sz w:val="14"/>
                 <w:szCs w:val="14"/>
               </w:rPr>
-              <w:t xml:space="preserve">Original</w:t>
+              <w:t xml:space="preserve">AI Safety Researcher CA / ZipRecruiter</w:t>
             </w:r>
           </w:p>
         </w:tc>
@@ -2917,7 +2917,7 @@
                 <w:sz w:val="15"/>
                 <w:szCs w:val="15"/>
               </w:rPr>
-              <w:t xml:space="preserve">$170K to $230K</w:t>
+              <w:t xml:space="preserve">$130K to $175K</w:t>
             </w:r>
           </w:p>
         </w:tc>
@@ -2993,7 +2993,7 @@
                 <w:sz w:val="15"/>
                 <w:szCs w:val="15"/>
               </w:rPr>
-              <w:t xml:space="preserve">$82 to $111</w:t>
+              <w:t xml:space="preserve">$63 to $84</w:t>
             </w:r>
           </w:p>
         </w:tc>
@@ -3031,7 +3031,7 @@
                 <w:sz w:val="14"/>
                 <w:szCs w:val="14"/>
               </w:rPr>
-              <w:t xml:space="preserve">Original</w:t>
+              <w:t xml:space="preserve">AI Safety Researcher CA / ZipRecruiter</w:t>
             </w:r>
           </w:p>
         </w:tc>
@@ -3267,7 +3267,7 @@
                 <w:sz w:val="15"/>
                 <w:szCs w:val="15"/>
               </w:rPr>
-              <w:t xml:space="preserve">$170K to $230K</w:t>
+              <w:t xml:space="preserve">$130K to $175K</w:t>
             </w:r>
           </w:p>
         </w:tc>
@@ -3345,7 +3345,7 @@
                 <w:sz w:val="15"/>
                 <w:szCs w:val="15"/>
               </w:rPr>
-              <w:t xml:space="preserve">$82 to $111</w:t>
+              <w:t xml:space="preserve">$63 to $84</w:t>
             </w:r>
           </w:p>
         </w:tc>
@@ -3384,7 +3384,7 @@
                 <w:sz w:val="14"/>
                 <w:szCs w:val="14"/>
               </w:rPr>
-              <w:t xml:space="preserve">Original</w:t>
+              <w:t xml:space="preserve">AI Safety Researcher CA / ZipRecruiter</w:t>
             </w:r>
           </w:p>
         </w:tc>
@@ -3614,7 +3614,7 @@
                 <w:sz w:val="15"/>
                 <w:szCs w:val="15"/>
               </w:rPr>
-              <w:t xml:space="preserve">$170K to $230K</w:t>
+              <w:t xml:space="preserve">$130K to $175K</w:t>
             </w:r>
           </w:p>
         </w:tc>
@@ -3690,7 +3690,7 @@
                 <w:sz w:val="15"/>
                 <w:szCs w:val="15"/>
               </w:rPr>
-              <w:t xml:space="preserve">$82 to $111</w:t>
+              <w:t xml:space="preserve">$63 to $84</w:t>
             </w:r>
           </w:p>
         </w:tc>
@@ -3728,7 +3728,7 @@
                 <w:sz w:val="14"/>
                 <w:szCs w:val="14"/>
               </w:rPr>
-              <w:t xml:space="preserve">Original</w:t>
+              <w:t xml:space="preserve">AI Safety Researcher CA / ZipRecruiter</w:t>
             </w:r>
           </w:p>
         </w:tc>
@@ -3964,7 +3964,7 @@
                 <w:sz w:val="15"/>
                 <w:szCs w:val="15"/>
               </w:rPr>
-              <w:t xml:space="preserve">$95K to $135K</w:t>
+              <w:t xml:space="preserve">$80K to $115K</w:t>
             </w:r>
           </w:p>
         </w:tc>
@@ -4042,7 +4042,7 @@
                 <w:sz w:val="15"/>
                 <w:szCs w:val="15"/>
               </w:rPr>
-              <w:t xml:space="preserve">$46 to $65</w:t>
+              <w:t xml:space="preserve">$38 to $55</w:t>
             </w:r>
           </w:p>
         </w:tc>
@@ -4081,7 +4081,7 @@
                 <w:sz w:val="14"/>
                 <w:szCs w:val="14"/>
               </w:rPr>
-              <w:t xml:space="preserve">Original</w:t>
+              <w:t xml:space="preserve">Indeed LA / Glassdoor LA</w:t>
             </w:r>
           </w:p>
         </w:tc>
@@ -4311,7 +4311,7 @@
                 <w:sz w:val="15"/>
                 <w:szCs w:val="15"/>
               </w:rPr>
-              <w:t xml:space="preserve">$120K to $160K</w:t>
+              <w:t xml:space="preserve">$100K to $140K</w:t>
             </w:r>
           </w:p>
         </w:tc>
@@ -4387,7 +4387,7 @@
                 <w:sz w:val="15"/>
                 <w:szCs w:val="15"/>
               </w:rPr>
-              <w:t xml:space="preserve">$58 to $77</w:t>
+              <w:t xml:space="preserve">$48 to $67</w:t>
             </w:r>
           </w:p>
         </w:tc>
@@ -4425,7 +4425,7 @@
                 <w:sz w:val="14"/>
                 <w:szCs w:val="14"/>
               </w:rPr>
-              <w:t xml:space="preserve">Gap Analysis</w:t>
+              <w:t xml:space="preserve">Indeed LA / Salary.com</w:t>
             </w:r>
           </w:p>
         </w:tc>
@@ -4661,7 +4661,7 @@
                 <w:sz w:val="15"/>
                 <w:szCs w:val="15"/>
               </w:rPr>
-              <w:t xml:space="preserve">$85K to $120K</w:t>
+              <w:t xml:space="preserve">$75K to $105K</w:t>
             </w:r>
           </w:p>
         </w:tc>
@@ -4739,7 +4739,7 @@
                 <w:sz w:val="15"/>
                 <w:szCs w:val="15"/>
               </w:rPr>
-              <w:t xml:space="preserve">$41 to $58</w:t>
+              <w:t xml:space="preserve">$36 to $50</w:t>
             </w:r>
           </w:p>
         </w:tc>
@@ -4778,7 +4778,7 @@
                 <w:sz w:val="14"/>
                 <w:szCs w:val="14"/>
               </w:rPr>
-              <w:t xml:space="preserve">Original</w:t>
+              <w:t xml:space="preserve">BLS / Built In LA</w:t>
             </w:r>
           </w:p>
         </w:tc>
@@ -5122,7 +5122,7 @@
                 <w:sz w:val="14"/>
                 <w:szCs w:val="14"/>
               </w:rPr>
-              <w:t xml:space="preserve">Floating</w:t>
+              <w:t xml:space="preserve">PayScale LA</w:t>
             </w:r>
           </w:p>
         </w:tc>
@@ -5358,7 +5358,7 @@
                 <w:sz w:val="15"/>
                 <w:szCs w:val="15"/>
               </w:rPr>
-              <w:t xml:space="preserve">$160K to $220K</w:t>
+              <w:t xml:space="preserve">$155K to $210K</w:t>
             </w:r>
           </w:p>
         </w:tc>
@@ -5436,7 +5436,7 @@
                 <w:sz w:val="15"/>
                 <w:szCs w:val="15"/>
               </w:rPr>
-              <w:t xml:space="preserve">$77 to $106</w:t>
+              <w:t xml:space="preserve">$75 to $101</w:t>
             </w:r>
           </w:p>
         </w:tc>
@@ -5475,7 +5475,7 @@
                 <w:sz w:val="14"/>
                 <w:szCs w:val="14"/>
               </w:rPr>
-              <w:t xml:space="preserve">Gap Analysis</w:t>
+              <w:t xml:space="preserve">Robert Half SF / Levels.fyi</w:t>
             </w:r>
           </w:p>
         </w:tc>
@@ -5819,7 +5819,7 @@
                 <w:sz w:val="14"/>
                 <w:szCs w:val="14"/>
               </w:rPr>
-              <w:t xml:space="preserve">Gap Analysis</w:t>
+              <w:t xml:space="preserve">Academic IRB consultant rate</w:t>
             </w:r>
           </w:p>
         </w:tc>
@@ -6092,7 +6092,7 @@
                 <w:sz w:val="15"/>
                 <w:szCs w:val="15"/>
               </w:rPr>
-              <w:t xml:space="preserve">$200K to $275K</w:t>
+              <w:t xml:space="preserve">$160K to $200K</w:t>
             </w:r>
           </w:p>
         </w:tc>
@@ -6170,7 +6170,7 @@
                 <w:sz w:val="15"/>
                 <w:szCs w:val="15"/>
               </w:rPr>
-              <w:t xml:space="preserve">$96 to $132</w:t>
+              <w:t xml:space="preserve">$77 to $96</w:t>
             </w:r>
           </w:p>
         </w:tc>
@@ -6209,7 +6209,7 @@
                 <w:sz w:val="14"/>
                 <w:szCs w:val="14"/>
               </w:rPr>
-              <w:t xml:space="preserve">Original</w:t>
+              <w:t xml:space="preserve">ZipRecruiter SF / Salary.com SF</w:t>
             </w:r>
           </w:p>
         </w:tc>
@@ -6553,7 +6553,7 @@
                 <w:sz w:val="14"/>
                 <w:szCs w:val="14"/>
               </w:rPr>
-              <w:t xml:space="preserve">Original</w:t>
+              <w:t xml:space="preserve">Robert Half SF 2026</w:t>
             </w:r>
           </w:p>
         </w:tc>
@@ -6789,7 +6789,7 @@
                 <w:sz w:val="15"/>
                 <w:szCs w:val="15"/>
               </w:rPr>
-              <w:t xml:space="preserve">$90K to $130K</w:t>
+              <w:t xml:space="preserve">$75K to $105K</w:t>
             </w:r>
           </w:p>
         </w:tc>
@@ -6867,7 +6867,7 @@
                 <w:sz w:val="15"/>
                 <w:szCs w:val="15"/>
               </w:rPr>
-              <w:t xml:space="preserve">$43 to $63</w:t>
+              <w:t xml:space="preserve">$36 to $50</w:t>
             </w:r>
           </w:p>
         </w:tc>
@@ -6906,7 +6906,7 @@
                 <w:sz w:val="14"/>
                 <w:szCs w:val="14"/>
               </w:rPr>
-              <w:t xml:space="preserve">Gap Analysis</w:t>
+              <w:t xml:space="preserve">Indeed LA / ZipRecruiter</w:t>
             </w:r>
           </w:p>
         </w:tc>
@@ -7136,7 +7136,7 @@
                 <w:sz w:val="15"/>
                 <w:szCs w:val="15"/>
               </w:rPr>
-              <w:t xml:space="preserve">$160K to $220K</w:t>
+              <w:t xml:space="preserve">$155K to $210K</w:t>
             </w:r>
           </w:p>
         </w:tc>
@@ -7212,7 +7212,7 @@
                 <w:sz w:val="15"/>
                 <w:szCs w:val="15"/>
               </w:rPr>
-              <w:t xml:space="preserve">$77 to $106</w:t>
+              <w:t xml:space="preserve">$75 to $101</w:t>
             </w:r>
           </w:p>
         </w:tc>
@@ -7250,7 +7250,7 @@
                 <w:sz w:val="14"/>
                 <w:szCs w:val="14"/>
               </w:rPr>
-              <w:t xml:space="preserve">Gap Analysis</w:t>
+              <w:t xml:space="preserve">Robert Half SF / Built In LA</w:t>
             </w:r>
           </w:p>
         </w:tc>
@@ -7523,7 +7523,7 @@
                 <w:sz w:val="15"/>
                 <w:szCs w:val="15"/>
               </w:rPr>
-              <w:t xml:space="preserve">$150K to $200K</w:t>
+              <w:t xml:space="preserve">$140K to $185K</w:t>
             </w:r>
           </w:p>
         </w:tc>
@@ -7601,7 +7601,7 @@
                 <w:sz w:val="15"/>
                 <w:szCs w:val="15"/>
               </w:rPr>
-              <w:t xml:space="preserve">$72 to $96</w:t>
+              <w:t xml:space="preserve">$67 to $89</w:t>
             </w:r>
           </w:p>
         </w:tc>
@@ -7640,7 +7640,7 @@
                 <w:sz w:val="14"/>
                 <w:szCs w:val="14"/>
               </w:rPr>
-              <w:t xml:space="preserve">Revenue Model</w:t>
+              <w:t xml:space="preserve">Indeed LA / Glassdoor</w:t>
             </w:r>
           </w:p>
         </w:tc>
@@ -7870,7 +7870,7 @@
                 <w:sz w:val="15"/>
                 <w:szCs w:val="15"/>
               </w:rPr>
-              <w:t xml:space="preserve">$100K to $140K</w:t>
+              <w:t xml:space="preserve">$90K to $130K</w:t>
             </w:r>
           </w:p>
         </w:tc>
@@ -7946,7 +7946,7 @@
                 <w:sz w:val="15"/>
                 <w:szCs w:val="15"/>
               </w:rPr>
-              <w:t xml:space="preserve">$48 to $67</w:t>
+              <w:t xml:space="preserve">$43 to $63</w:t>
             </w:r>
           </w:p>
         </w:tc>
@@ -7984,7 +7984,7 @@
                 <w:sz w:val="14"/>
                 <w:szCs w:val="14"/>
               </w:rPr>
-              <w:t xml:space="preserve">Revenue Model</w:t>
+              <w:t xml:space="preserve">Indeed LA / ZipRecruiter</w:t>
             </w:r>
           </w:p>
         </w:tc>
@@ -9415,7 +9415,7 @@
                 <w:sz w:val="14"/>
                 <w:szCs w:val="14"/>
               </w:rPr>
-              <w:t xml:space="preserve">Gap Analysis</w:t>
+              <w:t xml:space="preserve">Georgetown CSET / think tank policy</w:t>
             </w:r>
           </w:p>
         </w:tc>
@@ -9651,7 +9651,7 @@
                 <w:sz w:val="15"/>
                 <w:szCs w:val="15"/>
               </w:rPr>
-              <w:t xml:space="preserve">$140K to $180K</w:t>
+              <w:t xml:space="preserve">$130K to $170K</w:t>
             </w:r>
           </w:p>
         </w:tc>
@@ -9729,7 +9729,7 @@
                 <w:sz w:val="15"/>
                 <w:szCs w:val="15"/>
               </w:rPr>
-              <w:t xml:space="preserve">$67 to $87</w:t>
+              <w:t xml:space="preserve">$63 to $82</w:t>
             </w:r>
           </w:p>
         </w:tc>
@@ -9768,7 +9768,7 @@
                 <w:sz w:val="14"/>
                 <w:szCs w:val="14"/>
               </w:rPr>
-              <w:t xml:space="preserve">Gap Analysis</w:t>
+              <w:t xml:space="preserve">Indeed LA / university relations</w:t>
             </w:r>
           </w:p>
         </w:tc>
@@ -10035,7 +10035,7 @@
                 <w:sz w:val="15"/>
                 <w:szCs w:val="15"/>
               </w:rPr>
-              <w:t xml:space="preserve">$110K to $150K</w:t>
+              <w:t xml:space="preserve">$100K to $140K</w:t>
             </w:r>
           </w:p>
         </w:tc>
@@ -10111,7 +10111,7 @@
                 <w:sz w:val="15"/>
                 <w:szCs w:val="15"/>
               </w:rPr>
-              <w:t xml:space="preserve">$53 to $72</w:t>
+              <w:t xml:space="preserve">$48 to $67</w:t>
             </w:r>
           </w:p>
         </w:tc>
@@ -10149,7 +10149,7 @@
                 <w:sz w:val="14"/>
                 <w:szCs w:val="14"/>
               </w:rPr>
-              <w:t xml:space="preserve">Revenue Model</w:t>
+              <w:t xml:space="preserve">Indeed LA / ZipRecruiter</w:t>
             </w:r>
           </w:p>
         </w:tc>
@@ -10385,7 +10385,7 @@
                 <w:sz w:val="15"/>
                 <w:szCs w:val="15"/>
               </w:rPr>
-              <w:t xml:space="preserve">$65K to $90K</w:t>
+              <w:t xml:space="preserve">$55K to $80K</w:t>
             </w:r>
           </w:p>
         </w:tc>
@@ -10463,7 +10463,7 @@
                 <w:sz w:val="15"/>
                 <w:szCs w:val="15"/>
               </w:rPr>
-              <w:t xml:space="preserve">$31 to $43</w:t>
+              <w:t xml:space="preserve">$26 to $38</w:t>
             </w:r>
           </w:p>
         </w:tc>
@@ -10502,7 +10502,7 @@
                 <w:sz w:val="14"/>
                 <w:szCs w:val="14"/>
               </w:rPr>
-              <w:t xml:space="preserve">Revenue Model</w:t>
+              <w:t xml:space="preserve">Indeed LA / ZipRecruiter</w:t>
             </w:r>
           </w:p>
         </w:tc>
@@ -10769,7 +10769,7 @@
                 <w:sz w:val="15"/>
                 <w:szCs w:val="15"/>
               </w:rPr>
-              <w:t xml:space="preserve">$130K to $175K</w:t>
+              <w:t xml:space="preserve">$90K to $130K</w:t>
             </w:r>
           </w:p>
         </w:tc>
@@ -10845,7 +10845,7 @@
                 <w:sz w:val="15"/>
                 <w:szCs w:val="15"/>
               </w:rPr>
-              <w:t xml:space="preserve">$63 to $84</w:t>
+              <w:t xml:space="preserve">$43 to $63</w:t>
             </w:r>
           </w:p>
         </w:tc>
@@ -10883,7 +10883,7 @@
                 <w:sz w:val="14"/>
                 <w:szCs w:val="14"/>
               </w:rPr>
-              <w:t xml:space="preserve">Original</w:t>
+              <w:t xml:space="preserve">Indeed LA community director</w:t>
             </w:r>
           </w:p>
         </w:tc>
@@ -11119,7 +11119,7 @@
                 <w:sz w:val="15"/>
                 <w:szCs w:val="15"/>
               </w:rPr>
-              <w:t xml:space="preserve">$110K to $150K</w:t>
+              <w:t xml:space="preserve">$95K to $135K</w:t>
             </w:r>
           </w:p>
         </w:tc>
@@ -11197,7 +11197,7 @@
                 <w:sz w:val="15"/>
                 <w:szCs w:val="15"/>
               </w:rPr>
-              <w:t xml:space="preserve">$53 to $72</w:t>
+              <w:t xml:space="preserve">$46 to $65</w:t>
             </w:r>
           </w:p>
         </w:tc>
@@ -11236,7 +11236,7 @@
                 <w:sz w:val="14"/>
                 <w:szCs w:val="14"/>
               </w:rPr>
-              <w:t xml:space="preserve">Original</w:t>
+              <w:t xml:space="preserve">Built In LA / Salary.com LA</w:t>
             </w:r>
           </w:p>
         </w:tc>
@@ -11466,7 +11466,7 @@
                 <w:sz w:val="15"/>
                 <w:szCs w:val="15"/>
               </w:rPr>
-              <w:t xml:space="preserve">$95K to $135K</w:t>
+              <w:t xml:space="preserve">$80K to $115K</w:t>
             </w:r>
           </w:p>
         </w:tc>
@@ -11542,7 +11542,7 @@
                 <w:sz w:val="15"/>
                 <w:szCs w:val="15"/>
               </w:rPr>
-              <w:t xml:space="preserve">$46 to $65</w:t>
+              <w:t xml:space="preserve">$38 to $55</w:t>
             </w:r>
           </w:p>
         </w:tc>
@@ -11580,7 +11580,7 @@
                 <w:sz w:val="14"/>
                 <w:szCs w:val="14"/>
               </w:rPr>
-              <w:t xml:space="preserve">Original</w:t>
+              <w:t xml:space="preserve">ZipRecruiter LA nonprofit mktg</w:t>
             </w:r>
           </w:p>
         </w:tc>
@@ -11816,7 +11816,7 @@
                 <w:sz w:val="15"/>
                 <w:szCs w:val="15"/>
               </w:rPr>
-              <w:t xml:space="preserve">$115K to $155K</w:t>
+              <w:t xml:space="preserve">$100K to $145K</w:t>
             </w:r>
           </w:p>
         </w:tc>
@@ -11894,7 +11894,7 @@
                 <w:sz w:val="15"/>
                 <w:szCs w:val="15"/>
               </w:rPr>
-              <w:t xml:space="preserve">$55 to $75</w:t>
+              <w:t xml:space="preserve">$48 to $70</w:t>
             </w:r>
           </w:p>
         </w:tc>
@@ -11933,7 +11933,7 @@
                 <w:sz w:val="14"/>
                 <w:szCs w:val="14"/>
               </w:rPr>
-              <w:t xml:space="preserve">Original</w:t>
+              <w:t xml:space="preserve">Salary.com LA / Comparably LA</w:t>
             </w:r>
           </w:p>
         </w:tc>
@@ -12163,7 +12163,7 @@
                 <w:sz w:val="15"/>
                 <w:szCs w:val="15"/>
               </w:rPr>
-              <w:t xml:space="preserve">$90K to $130K</w:t>
+              <w:t xml:space="preserve">$80K to $115K</w:t>
             </w:r>
           </w:p>
         </w:tc>
@@ -12239,7 +12239,7 @@
                 <w:sz w:val="15"/>
                 <w:szCs w:val="15"/>
               </w:rPr>
-              <w:t xml:space="preserve">$43 to $63</w:t>
+              <w:t xml:space="preserve">$38 to $55</w:t>
             </w:r>
           </w:p>
         </w:tc>
@@ -12277,7 +12277,7 @@
                 <w:sz w:val="14"/>
                 <w:szCs w:val="14"/>
               </w:rPr>
-              <w:t xml:space="preserve">Gap Analysis</w:t>
+              <w:t xml:space="preserve">Indeed LA / ZipRecruiter</w:t>
             </w:r>
           </w:p>
         </w:tc>
@@ -12550,7 +12550,7 @@
                 <w:sz w:val="15"/>
                 <w:szCs w:val="15"/>
               </w:rPr>
-              <w:t xml:space="preserve">$140K to $185K</w:t>
+              <w:t xml:space="preserve">$130K to $175K</w:t>
             </w:r>
           </w:p>
         </w:tc>
@@ -12628,7 +12628,7 @@
                 <w:sz w:val="15"/>
                 <w:szCs w:val="15"/>
               </w:rPr>
-              <w:t xml:space="preserve">$67 to $89</w:t>
+              <w:t xml:space="preserve">$63 to $84</w:t>
             </w:r>
           </w:p>
         </w:tc>
@@ -12667,7 +12667,7 @@
                 <w:sz w:val="14"/>
                 <w:szCs w:val="14"/>
               </w:rPr>
-              <w:t xml:space="preserve">Revenue Model</w:t>
+              <w:t xml:space="preserve">Indeed LA / Glassdoor</w:t>
             </w:r>
           </w:p>
         </w:tc>
@@ -12897,7 +12897,7 @@
                 <w:sz w:val="15"/>
                 <w:szCs w:val="15"/>
               </w:rPr>
-              <w:t xml:space="preserve">$75K to $110K</w:t>
+              <w:t xml:space="preserve">$70K to $100K</w:t>
             </w:r>
           </w:p>
         </w:tc>
@@ -12973,7 +12973,7 @@
                 <w:sz w:val="15"/>
                 <w:szCs w:val="15"/>
               </w:rPr>
-              <w:t xml:space="preserve">$36 to $53</w:t>
+              <w:t xml:space="preserve">$34 to $48</w:t>
             </w:r>
           </w:p>
         </w:tc>
@@ -13011,7 +13011,7 @@
                 <w:sz w:val="14"/>
                 <w:szCs w:val="14"/>
               </w:rPr>
-              <w:t xml:space="preserve">Revenue Model</w:t>
+              <w:t xml:space="preserve">Indeed LA / Glassdoor</w:t>
             </w:r>
           </w:p>
         </w:tc>
@@ -13284,7 +13284,7 @@
                 <w:sz w:val="15"/>
                 <w:szCs w:val="15"/>
               </w:rPr>
-              <w:t xml:space="preserve">$110K to $150K</w:t>
+              <w:t xml:space="preserve">$95K to $135K</w:t>
             </w:r>
           </w:p>
         </w:tc>
@@ -13362,7 +13362,7 @@
                 <w:sz w:val="15"/>
                 <w:szCs w:val="15"/>
               </w:rPr>
-              <w:t xml:space="preserve">$53 to $72</w:t>
+              <w:t xml:space="preserve">$46 to $65</w:t>
             </w:r>
           </w:p>
         </w:tc>
@@ -13401,7 +13401,7 @@
                 <w:sz w:val="14"/>
                 <w:szCs w:val="14"/>
               </w:rPr>
-              <w:t xml:space="preserve">Floating</w:t>
+              <w:t xml:space="preserve">Indeed LA / Salary.com</w:t>
             </w:r>
           </w:p>
         </w:tc>
@@ -13668,7 +13668,7 @@
                 <w:sz w:val="15"/>
                 <w:szCs w:val="15"/>
               </w:rPr>
-              <w:t xml:space="preserve">$110K to $150K</w:t>
+              <w:t xml:space="preserve">$85K to $120K</w:t>
             </w:r>
           </w:p>
         </w:tc>
@@ -13744,7 +13744,7 @@
                 <w:sz w:val="15"/>
                 <w:szCs w:val="15"/>
               </w:rPr>
-              <w:t xml:space="preserve">$53 to $72</w:t>
+              <w:t xml:space="preserve">$41 to $58</w:t>
             </w:r>
           </w:p>
         </w:tc>
@@ -13782,7 +13782,7 @@
                 <w:sz w:val="14"/>
                 <w:szCs w:val="14"/>
               </w:rPr>
-              <w:t xml:space="preserve">Original</w:t>
+              <w:t xml:space="preserve">Comparably LA / nonprofit avg</w:t>
             </w:r>
           </w:p>
         </w:tc>
@@ -14018,7 +14018,7 @@
                 <w:sz w:val="15"/>
                 <w:szCs w:val="15"/>
               </w:rPr>
-              <w:t xml:space="preserve">$125K to $170K</w:t>
+              <w:t xml:space="preserve">$110K to $150K</w:t>
             </w:r>
           </w:p>
         </w:tc>
@@ -14096,7 +14096,7 @@
                 <w:sz w:val="15"/>
                 <w:szCs w:val="15"/>
               </w:rPr>
-              <w:t xml:space="preserve">$60 to $82</w:t>
+              <w:t xml:space="preserve">$53 to $72</w:t>
             </w:r>
           </w:p>
         </w:tc>
@@ -14135,7 +14135,7 @@
                 <w:sz w:val="14"/>
                 <w:szCs w:val="14"/>
               </w:rPr>
-              <w:t xml:space="preserve">Original</w:t>
+              <w:t xml:space="preserve">ZipRecruiter CA / Salary.com LA</w:t>
             </w:r>
           </w:p>
         </w:tc>
@@ -14365,7 +14365,7 @@
                 <w:sz w:val="15"/>
                 <w:szCs w:val="15"/>
               </w:rPr>
-              <w:t xml:space="preserve">$52K to $72K</w:t>
+              <w:t xml:space="preserve">$45K to $65K</w:t>
             </w:r>
           </w:p>
         </w:tc>
@@ -14441,7 +14441,7 @@
                 <w:sz w:val="15"/>
                 <w:szCs w:val="15"/>
               </w:rPr>
-              <w:t xml:space="preserve">$25 to $35</w:t>
+              <w:t xml:space="preserve">$22 to $31</w:t>
             </w:r>
           </w:p>
         </w:tc>
@@ -14479,7 +14479,7 @@
                 <w:sz w:val="14"/>
                 <w:szCs w:val="14"/>
               </w:rPr>
-              <w:t xml:space="preserve">Gap Analysis</w:t>
+              <w:t xml:space="preserve">Indeed LA / ZipRecruiter PT</w:t>
             </w:r>
           </w:p>
         </w:tc>
@@ -14715,7 +14715,7 @@
                 <w:sz w:val="15"/>
                 <w:szCs w:val="15"/>
               </w:rPr>
-              <w:t xml:space="preserve">$55K to $75K</w:t>
+              <w:t xml:space="preserve">$50K to $70K</w:t>
             </w:r>
           </w:p>
         </w:tc>
@@ -14793,7 +14793,7 @@
                 <w:sz w:val="15"/>
                 <w:szCs w:val="15"/>
               </w:rPr>
-              <w:t xml:space="preserve">$26 to $36</w:t>
+              <w:t xml:space="preserve">$24 to $34</w:t>
             </w:r>
           </w:p>
         </w:tc>
@@ -14832,7 +14832,7 @@
                 <w:sz w:val="14"/>
                 <w:szCs w:val="14"/>
               </w:rPr>
-              <w:t xml:space="preserve">Revenue Model</w:t>
+              <w:t xml:space="preserve">Indeed LA / ZipRecruiter</w:t>
             </w:r>
           </w:p>
         </w:tc>
@@ -15062,7 +15062,7 @@
                 <w:sz w:val="15"/>
                 <w:szCs w:val="15"/>
               </w:rPr>
-              <w:t xml:space="preserve">$110K to $150K</w:t>
+              <w:t xml:space="preserve">$95K to $130K</w:t>
             </w:r>
           </w:p>
         </w:tc>
@@ -15138,7 +15138,7 @@
                 <w:sz w:val="15"/>
                 <w:szCs w:val="15"/>
               </w:rPr>
-              <w:t xml:space="preserve">$53 to $72</w:t>
+              <w:t xml:space="preserve">$46 to $63</w:t>
             </w:r>
           </w:p>
         </w:tc>
@@ -15176,7 +15176,7 @@
                 <w:sz w:val="14"/>
                 <w:szCs w:val="14"/>
               </w:rPr>
-              <w:t xml:space="preserve">Revenue Model</w:t>
+              <w:t xml:space="preserve">Indeed LA / Glassdoor</w:t>
             </w:r>
           </w:p>
         </w:tc>
@@ -15412,7 +15412,7 @@
                 <w:sz w:val="15"/>
                 <w:szCs w:val="15"/>
               </w:rPr>
-              <w:t xml:space="preserve">$95K to $135K</w:t>
+              <w:t xml:space="preserve">$100K to $145K</w:t>
             </w:r>
           </w:p>
         </w:tc>
@@ -15490,7 +15490,7 @@
                 <w:sz w:val="15"/>
                 <w:szCs w:val="15"/>
               </w:rPr>
-              <w:t xml:space="preserve">$46 to $65</w:t>
+              <w:t xml:space="preserve">$48 to $70</w:t>
             </w:r>
           </w:p>
         </w:tc>
@@ -15529,7 +15529,7 @@
                 <w:sz w:val="14"/>
                 <w:szCs w:val="14"/>
               </w:rPr>
-              <w:t xml:space="preserve">Original</w:t>
+              <w:t xml:space="preserve">Indeed LA / Glassdoor SF</w:t>
             </w:r>
           </w:p>
         </w:tc>
@@ -15759,7 +15759,7 @@
                 <w:sz w:val="15"/>
                 <w:szCs w:val="15"/>
               </w:rPr>
-              <w:t xml:space="preserve">$75K to $110K</w:t>
+              <w:t xml:space="preserve">$85K to $120K</w:t>
             </w:r>
           </w:p>
         </w:tc>
@@ -15835,7 +15835,7 @@
                 <w:sz w:val="15"/>
                 <w:szCs w:val="15"/>
               </w:rPr>
-              <w:t xml:space="preserve">$36 to $53</w:t>
+              <w:t xml:space="preserve">$41 to $58</w:t>
             </w:r>
           </w:p>
         </w:tc>
@@ -15873,7 +15873,7 @@
                 <w:sz w:val="14"/>
                 <w:szCs w:val="14"/>
               </w:rPr>
-              <w:t xml:space="preserve">Original</w:t>
+              <w:t xml:space="preserve">Comparably SF / 500 Startups</w:t>
             </w:r>
           </w:p>
         </w:tc>
@@ -16226,7 +16226,7 @@
                 <w:sz w:val="14"/>
                 <w:szCs w:val="14"/>
               </w:rPr>
-              <w:t xml:space="preserve">Gap Analysis</w:t>
+              <w:t xml:space="preserve">LA startup attorney rate</w:t>
             </w:r>
           </w:p>
         </w:tc>
@@ -16493,7 +16493,7 @@
                 <w:sz w:val="15"/>
                 <w:szCs w:val="15"/>
               </w:rPr>
-              <w:t xml:space="preserve">$95K to $140K</w:t>
+              <w:t xml:space="preserve">$80K to $110K</w:t>
             </w:r>
           </w:p>
         </w:tc>
@@ -16569,7 +16569,7 @@
                 <w:sz w:val="15"/>
                 <w:szCs w:val="15"/>
               </w:rPr>
-              <w:t xml:space="preserve">$46 to $67</w:t>
+              <w:t xml:space="preserve">$38 to $53</w:t>
             </w:r>
           </w:p>
         </w:tc>
@@ -16607,7 +16607,7 @@
                 <w:sz w:val="14"/>
                 <w:szCs w:val="14"/>
               </w:rPr>
-              <w:t xml:space="preserve">Original</w:t>
+              <w:t xml:space="preserve">ERI LA / Salary.com 90th pct</w:t>
             </w:r>
           </w:p>
         </w:tc>
@@ -24603,7 +24603,7 @@
           <w:sz w:val="20"/>
           <w:szCs w:val="20"/>
         </w:rPr>
-        <w:t xml:space="preserve">Complete rebuild. Added 3 missing sales reps (#22, #23, #24). Created new Policy &amp; External Relations department for Head of AI Policy (#25) and Head of Academic Relations (#26). Fixed all duplicate numbering. Added Comp Type column. All sales roles marked Base + Commission. Sequential numbering #1 through #45 with no gaps or duplicates. 11 departments.</w:t>
+        <w:t xml:space="preserve">Complete rebuild. Added 3 missing sales reps (#22, #23, #24). Created new Policy &amp; External Relations department for Head of AI Policy (#25) and Head of Academic Relations (#26). Fixed all duplicate numbering. Added Comp Type column. All sales roles marked Base + Commission. Sequential numbering #1 through #45 with no gaps or duplicates. 11 departments. Updated all salary ranges and sources to Perplexity-verified market benchmarks (ZipRecruiter, Indeed, Glassdoor, Robert Half, Salary.com, Levels.fyi, BLS, ERI, Comparably, Georgetown CSET).</w:t>
       </w:r>
     </w:p>
     <w:p>

</xml_diff>